<commit_message>
Finestra a destra: la scrittura in partita doppia resta nascosta fino al tentativo dell'allievo
- Le spiegazioni sulle righe del giornale (paghe per dipendente, AFAB per
  cespite) passano in «dopo»: compaiono solo con la soluzione, dopo che
  l'allievo ha registrato e ricostruito la scrittura.
- Sui passi contabili non ancora registrati il pannello chiede all'allievo
  di registrare l'operazione e ricostruire lui conto, Dare/Avere e importo.
- Nuovo test tests/soluzione-nascosta.js nella suite: passi contabili
  marcati, nessun conto Dare/Avere visibile prima del tentativo, pannello
  reale che nasconde e poi mostra la soluzione.

Co-Authored-By: Claude Opus 5.5 <noreply@anthropic.com>
Claude-Session: https://claude.ai/code/session_01GvdGiBc9qkzwbxMtpiwpr2
</commit_message>
<xml_diff>
--- a/app/static/docs/Esercitazione_Dicembre_2026.docx
+++ b/app/static/docs/Esercitazione_Dicembre_2026.docx
@@ -1750,7 +1750,7 @@
           <w:sz w:val="18"/>
           <w:szCs w:val="18"/>
         </w:rPr>
-        <w:t xml:space="preserve">Nel programma questo riquadro compare dopo che hai registrato e ricostruito la scrittura.</w:t>
+        <w:t xml:space="preserve">Nel programma la soluzione compare dopo che hai registrato e ricostruito la scrittura.</w:t>
       </w:r>
     </w:p>
     <w:p>
@@ -2134,7 +2134,7 @@
           <w:sz w:val="18"/>
           <w:szCs w:val="18"/>
         </w:rPr>
-        <w:t xml:space="preserve">Nel programma questo riquadro compare dopo che hai registrato e ricostruito la scrittura.</w:t>
+        <w:t xml:space="preserve">Nel programma la soluzione compare dopo che hai registrato e ricostruito la scrittura.</w:t>
       </w:r>
     </w:p>
     <w:p>
@@ -3255,7 +3255,7 @@
           <w:sz w:val="18"/>
           <w:szCs w:val="18"/>
         </w:rPr>
-        <w:t xml:space="preserve">Nel programma questo riquadro compare dopo che hai registrato e ricostruito la scrittura.</w:t>
+        <w:t xml:space="preserve">Nel programma la soluzione compare dopo che hai registrato e ricostruito la scrittura.</w:t>
       </w:r>
     </w:p>
     <w:p>
@@ -3982,7 +3982,7 @@
           <w:sz w:val="18"/>
           <w:szCs w:val="18"/>
         </w:rPr>
-        <w:t xml:space="preserve">Nel programma questo riquadro compare dopo che hai registrato e ricostruito la scrittura.</w:t>
+        <w:t xml:space="preserve">Nel programma la soluzione compare dopo che hai registrato e ricostruito la scrittura.</w:t>
       </w:r>
     </w:p>
     <w:p>
@@ -4709,7 +4709,7 @@
           <w:sz w:val="18"/>
           <w:szCs w:val="18"/>
         </w:rPr>
-        <w:t xml:space="preserve">Nel programma questo riquadro compare dopo che hai registrato e ricostruito la scrittura.</w:t>
+        <w:t xml:space="preserve">Nel programma la soluzione compare dopo che hai registrato e ricostruito la scrittura.</w:t>
       </w:r>
     </w:p>
     <w:p>
@@ -5436,7 +5436,7 @@
           <w:sz w:val="18"/>
           <w:szCs w:val="18"/>
         </w:rPr>
-        <w:t xml:space="preserve">Nel programma questo riquadro compare dopo che hai registrato e ricostruito la scrittura.</w:t>
+        <w:t xml:space="preserve">Nel programma la soluzione compare dopo che hai registrato e ricostruito la scrittura.</w:t>
       </w:r>
     </w:p>
     <w:p>
@@ -6163,7 +6163,7 @@
           <w:sz w:val="18"/>
           <w:szCs w:val="18"/>
         </w:rPr>
-        <w:t xml:space="preserve">Nel programma questo riquadro compare dopo che hai registrato e ricostruito la scrittura.</w:t>
+        <w:t xml:space="preserve">Nel programma la soluzione compare dopo che hai registrato e ricostruito la scrittura.</w:t>
       </w:r>
     </w:p>
     <w:p>
@@ -15623,7 +15623,7 @@
           <w:sz w:val="18"/>
           <w:szCs w:val="18"/>
         </w:rPr>
-        <w:t xml:space="preserve">Nel programma questo riquadro compare dopo che hai registrato e ricostruito la scrittura.</w:t>
+        <w:t xml:space="preserve">Nel programma la soluzione compare dopo che hai registrato e ricostruito la scrittura.</w:t>
       </w:r>
     </w:p>
     <w:p>
@@ -16106,7 +16106,7 @@
           <w:sz w:val="18"/>
           <w:szCs w:val="18"/>
         </w:rPr>
-        <w:t xml:space="preserve">Nel programma questo riquadro compare dopo che hai registrato e ricostruito la scrittura.</w:t>
+        <w:t xml:space="preserve">Nel programma la soluzione compare dopo che hai registrato e ricostruito la scrittura.</w:t>
       </w:r>
     </w:p>
     <w:p>
@@ -19520,7 +19520,7 @@
           <w:sz w:val="18"/>
           <w:szCs w:val="18"/>
         </w:rPr>
-        <w:t xml:space="preserve">Nel programma questo riquadro compare dopo che hai registrato e ricostruito la scrittura.</w:t>
+        <w:t xml:space="preserve">Nel programma la soluzione compare dopo che hai registrato e ricostruito la scrittura.</w:t>
       </w:r>
     </w:p>
     <w:p>
@@ -20455,7 +20455,7 @@
           <w:sz w:val="18"/>
           <w:szCs w:val="18"/>
         </w:rPr>
-        <w:t xml:space="preserve">Nel programma questo riquadro compare dopo che hai registrato e ricostruito la scrittura.</w:t>
+        <w:t xml:space="preserve">Nel programma la soluzione compare dopo che hai registrato e ricostruito la scrittura.</w:t>
       </w:r>
     </w:p>
     <w:p>
@@ -20961,7 +20961,7 @@
           <w:sz w:val="18"/>
           <w:szCs w:val="18"/>
         </w:rPr>
-        <w:t xml:space="preserve">Nel programma questo riquadro compare dopo che hai registrato e ricostruito la scrittura.</w:t>
+        <w:t xml:space="preserve">Nel programma la soluzione compare dopo che hai registrato e ricostruito la scrittura.</w:t>
       </w:r>
     </w:p>
     <w:p>
@@ -22033,7 +22033,7 @@
           <w:sz w:val="18"/>
           <w:szCs w:val="18"/>
         </w:rPr>
-        <w:t xml:space="preserve">Nel programma questo riquadro compare dopo che hai registrato e ricostruito la scrittura.</w:t>
+        <w:t xml:space="preserve">Nel programma la soluzione compare dopo che hai registrato e ricostruito la scrittura.</w:t>
       </w:r>
     </w:p>
     <w:p>
@@ -22823,7 +22823,7 @@
           <w:sz w:val="18"/>
           <w:szCs w:val="18"/>
         </w:rPr>
-        <w:t xml:space="preserve">Nel programma questo riquadro compare dopo che hai registrato e ricostruito la scrittura.</w:t>
+        <w:t xml:space="preserve">Nel programma la soluzione compare dopo che hai registrato e ricostruito la scrittura.</w:t>
       </w:r>
     </w:p>
     <w:p>
@@ -24928,7 +24928,7 @@
           <w:sz w:val="18"/>
           <w:szCs w:val="18"/>
         </w:rPr>
-        <w:t xml:space="preserve">Nel programma questo riquadro compare dopo che hai registrato e ricostruito la scrittura.</w:t>
+        <w:t xml:space="preserve">Nel programma la soluzione compare dopo che hai registrato e ricostruito la scrittura.</w:t>
       </w:r>
     </w:p>
     <w:p>
@@ -25533,7 +25533,7 @@
           <w:sz w:val="18"/>
           <w:szCs w:val="18"/>
         </w:rPr>
-        <w:t xml:space="preserve">Nel programma questo riquadro compare dopo che hai registrato e ricostruito la scrittura.</w:t>
+        <w:t xml:space="preserve">Nel programma la soluzione compare dopo che hai registrato e ricostruito la scrittura.</w:t>
       </w:r>
     </w:p>
     <w:p>
@@ -26151,7 +26151,7 @@
           <w:sz w:val="18"/>
           <w:szCs w:val="18"/>
         </w:rPr>
-        <w:t xml:space="preserve">Nel programma questo riquadro compare dopo che hai registrato e ricostruito la scrittura.</w:t>
+        <w:t xml:space="preserve">Nel programma la soluzione compare dopo che hai registrato e ricostruito la scrittura.</w:t>
       </w:r>
     </w:p>
     <w:p>
@@ -26756,7 +26756,7 @@
           <w:sz w:val="18"/>
           <w:szCs w:val="18"/>
         </w:rPr>
-        <w:t xml:space="preserve">Nel programma questo riquadro compare dopo che hai registrato e ricostruito la scrittura.</w:t>
+        <w:t xml:space="preserve">Nel programma la soluzione compare dopo che hai registrato e ricostruito la scrittura.</w:t>
       </w:r>
     </w:p>
     <w:p>
@@ -27178,7 +27178,7 @@
           <w:sz w:val="18"/>
           <w:szCs w:val="18"/>
         </w:rPr>
-        <w:t xml:space="preserve">Nel programma questo riquadro compare dopo che hai registrato e ricostruito la scrittura.</w:t>
+        <w:t xml:space="preserve">Nel programma la soluzione compare dopo che hai registrato e ricostruito la scrittura.</w:t>
       </w:r>
     </w:p>
     <w:p>
@@ -29161,7 +29161,7 @@
           <w:sz w:val="18"/>
           <w:szCs w:val="18"/>
         </w:rPr>
-        <w:t xml:space="preserve">Nel programma questo riquadro compare dopo che hai registrato e ricostruito la scrittura.</w:t>
+        <w:t xml:space="preserve">Nel programma la soluzione compare dopo che hai registrato e ricostruito la scrittura.</w:t>
       </w:r>
     </w:p>
     <w:p>
@@ -29705,7 +29705,7 @@
           <w:sz w:val="18"/>
           <w:szCs w:val="18"/>
         </w:rPr>
-        <w:t xml:space="preserve">Nel programma questo riquadro compare dopo che hai registrato e ricostruito la scrittura.</w:t>
+        <w:t xml:space="preserve">Nel programma la soluzione compare dopo che hai registrato e ricostruito la scrittura.</w:t>
       </w:r>
     </w:p>
     <w:p>
@@ -30127,7 +30127,7 @@
           <w:sz w:val="18"/>
           <w:szCs w:val="18"/>
         </w:rPr>
-        <w:t xml:space="preserve">Nel programma questo riquadro compare dopo che hai registrato e ricostruito la scrittura.</w:t>
+        <w:t xml:space="preserve">Nel programma la soluzione compare dopo che hai registrato e ricostruito la scrittura.</w:t>
       </w:r>
     </w:p>
     <w:p>
@@ -36770,7 +36770,7 @@
           <w:sz w:val="18"/>
           <w:szCs w:val="18"/>
         </w:rPr>
-        <w:t xml:space="preserve">Nel programma questo riquadro compare dopo che hai registrato e ricostruito la scrittura.</w:t>
+        <w:t xml:space="preserve">Nel programma la soluzione compare dopo che hai registrato e ricostruito la scrittura.</w:t>
       </w:r>
     </w:p>
     <w:p>
@@ -37526,7 +37526,7 @@
           <w:sz w:val="18"/>
           <w:szCs w:val="18"/>
         </w:rPr>
-        <w:t xml:space="preserve">Nel programma questo riquadro compare dopo che hai registrato e ricostruito la scrittura.</w:t>
+        <w:t xml:space="preserve">Nel programma la soluzione compare dopo che hai registrato e ricostruito la scrittura.</w:t>
       </w:r>
     </w:p>
     <w:p>
@@ -37887,7 +37887,7 @@
           <w:sz w:val="18"/>
           <w:szCs w:val="18"/>
         </w:rPr>
-        <w:t xml:space="preserve">Nel programma questo riquadro compare dopo che hai registrato e ricostruito la scrittura.</w:t>
+        <w:t xml:space="preserve">Nel programma la soluzione compare dopo che hai registrato e ricostruito la scrittura.</w:t>
       </w:r>
     </w:p>
     <w:p>
@@ -38715,7 +38715,7 @@
           <w:sz w:val="18"/>
           <w:szCs w:val="18"/>
         </w:rPr>
-        <w:t xml:space="preserve">Nel programma questo riquadro compare dopo che hai registrato e ricostruito la scrittura.</w:t>
+        <w:t xml:space="preserve">Nel programma la soluzione compare dopo che hai registrato e ricostruito la scrittura.</w:t>
       </w:r>
     </w:p>
     <w:p>
@@ -39137,7 +39137,7 @@
           <w:sz w:val="18"/>
           <w:szCs w:val="18"/>
         </w:rPr>
-        <w:t xml:space="preserve">Nel programma questo riquadro compare dopo che hai registrato e ricostruito la scrittura.</w:t>
+        <w:t xml:space="preserve">Nel programma la soluzione compare dopo che hai registrato e ricostruito la scrittura.</w:t>
       </w:r>
     </w:p>
     <w:p>
@@ -39559,7 +39559,7 @@
           <w:sz w:val="18"/>
           <w:szCs w:val="18"/>
         </w:rPr>
-        <w:t xml:space="preserve">Nel programma questo riquadro compare dopo che hai registrato e ricostruito la scrittura.</w:t>
+        <w:t xml:space="preserve">Nel programma la soluzione compare dopo che hai registrato e ricostruito la scrittura.</w:t>
       </w:r>
     </w:p>
     <w:p>
@@ -40116,7 +40116,7 @@
           <w:sz w:val="18"/>
           <w:szCs w:val="18"/>
         </w:rPr>
-        <w:t xml:space="preserve">Nel programma questo riquadro compare dopo che hai registrato e ricostruito la scrittura.</w:t>
+        <w:t xml:space="preserve">Nel programma la soluzione compare dopo che hai registrato e ricostruito la scrittura.</w:t>
       </w:r>
     </w:p>
     <w:p>
@@ -40696,7 +40696,7 @@
           <w:sz w:val="18"/>
           <w:szCs w:val="18"/>
         </w:rPr>
-        <w:t xml:space="preserve">Nel programma questo riquadro compare dopo che hai registrato e ricostruito la scrittura.</w:t>
+        <w:t xml:space="preserve">Nel programma la soluzione compare dopo che hai registrato e ricostruito la scrittura.</w:t>
       </w:r>
     </w:p>
     <w:p>
@@ -41240,7 +41240,7 @@
           <w:sz w:val="18"/>
           <w:szCs w:val="18"/>
         </w:rPr>
-        <w:t xml:space="preserve">Nel programma questo riquadro compare dopo che hai registrato e ricostruito la scrittura.</w:t>
+        <w:t xml:space="preserve">Nel programma la soluzione compare dopo che hai registrato e ricostruito la scrittura.</w:t>
       </w:r>
     </w:p>
     <w:p>
@@ -41614,7 +41614,7 @@
           <w:sz w:val="18"/>
           <w:szCs w:val="18"/>
         </w:rPr>
-        <w:t xml:space="preserve">Nel programma questo riquadro compare dopo che hai registrato e ricostruito la scrittura.</w:t>
+        <w:t xml:space="preserve">Nel programma la soluzione compare dopo che hai registrato e ricostruito la scrittura.</w:t>
       </w:r>
     </w:p>
     <w:p>
@@ -42110,7 +42110,7 @@
           <w:sz w:val="18"/>
           <w:szCs w:val="18"/>
         </w:rPr>
-        <w:t xml:space="preserve">Nel programma questo riquadro compare dopo che hai registrato e ricostruito la scrittura.</w:t>
+        <w:t xml:space="preserve">Nel programma la soluzione compare dopo che hai registrato e ricostruito la scrittura.</w:t>
       </w:r>
     </w:p>
     <w:p>
@@ -42593,7 +42593,7 @@
           <w:sz w:val="18"/>
           <w:szCs w:val="18"/>
         </w:rPr>
-        <w:t xml:space="preserve">Nel programma questo riquadro compare dopo che hai registrato e ricostruito la scrittura.</w:t>
+        <w:t xml:space="preserve">Nel programma la soluzione compare dopo che hai registrato e ricostruito la scrittura.</w:t>
       </w:r>
     </w:p>
     <w:p>
@@ -43286,6 +43286,29 @@
     </w:p>
     <w:p>
       <w:pPr>
+        <w:spacing w:after="80" w:before="60"/>
+      </w:pPr>
+      <w:r>
+        <w:rPr>
+          <w:rFonts w:ascii="Calibri" w:cs="Calibri" w:eastAsia="Calibri" w:hAnsi="Calibri"/>
+          <w:b/>
+          <w:bCs/>
+          <w:sz w:val="21"/>
+          <w:szCs w:val="21"/>
+        </w:rPr>
+        <w:t xml:space="preserve">Dopo il tentativo: </w:t>
+      </w:r>
+      <w:r>
+        <w:rPr>
+          <w:rFonts w:ascii="Calibri" w:cs="Calibri" w:eastAsia="Calibri" w:hAnsi="Calibri"/>
+          <w:sz w:val="21"/>
+          <w:szCs w:val="21"/>
+        </w:rPr>
+        <w:t xml:space="preserve">Nel giornale il programma scrive una riga per dipendente, con il centro di costo: 80, 81 e 82 compaiono tre volte (es. Salari 2.275,00 + 2.437,50 + 2.816,67 = 7.529,17). La somma per conto è quella qui sopra. Nel laboratorio di ragioneria puoi ricostruirla riga per riga oppure con un’unica riga per conto.</w:t>
+      </w:r>
+    </w:p>
+    <w:p>
+      <w:pPr>
         <w:spacing w:after="80" w:before="0"/>
       </w:pPr>
       <w:r>
@@ -43297,30 +43320,7 @@
           <w:sz w:val="18"/>
           <w:szCs w:val="18"/>
         </w:rPr>
-        <w:t xml:space="preserve">Nel programma questo riquadro compare dopo che hai registrato e ricostruito la scrittura.</w:t>
-      </w:r>
-    </w:p>
-    <w:p>
-      <w:pPr>
-        <w:spacing w:after="80" w:before="60"/>
-      </w:pPr>
-      <w:r>
-        <w:rPr>
-          <w:rFonts w:ascii="Calibri" w:cs="Calibri" w:eastAsia="Calibri" w:hAnsi="Calibri"/>
-          <w:b/>
-          <w:bCs/>
-          <w:sz w:val="21"/>
-          <w:szCs w:val="21"/>
-        </w:rPr>
-        <w:t xml:space="preserve">Attenzione: </w:t>
-      </w:r>
-      <w:r>
-        <w:rPr>
-          <w:rFonts w:ascii="Calibri" w:cs="Calibri" w:eastAsia="Calibri" w:hAnsi="Calibri"/>
-          <w:sz w:val="21"/>
-          <w:szCs w:val="21"/>
-        </w:rPr>
-        <w:t xml:space="preserve">Nel giornale il programma scrive una riga per dipendente, con il centro di costo: 80, 81 e 82 compaiono tre volte (es. Salari 2.275,00 + 2.437,50 + 2.816,67 = 7.529,17). La somma per conto è quella qui sopra. Nel laboratorio di ragioneria puoi ricostruirla riga per riga oppure con un’unica riga per conto.</w:t>
+        <w:t xml:space="preserve">Nel programma la soluzione compare dopo che hai registrato e ricostruito la scrittura.</w:t>
       </w:r>
     </w:p>
     <w:p>
@@ -43681,7 +43681,7 @@
           <w:sz w:val="18"/>
           <w:szCs w:val="18"/>
         </w:rPr>
-        <w:t xml:space="preserve">Nel programma questo riquadro compare dopo che hai registrato e ricostruito la scrittura.</w:t>
+        <w:t xml:space="preserve">Nel programma la soluzione compare dopo che hai registrato e ricostruito la scrittura.</w:t>
       </w:r>
     </w:p>
     <w:p>
@@ -44360,7 +44360,7 @@
           <w:sz w:val="18"/>
           <w:szCs w:val="18"/>
         </w:rPr>
-        <w:t xml:space="preserve">Nel programma questo riquadro compare dopo che hai registrato e ricostruito la scrittura.</w:t>
+        <w:t xml:space="preserve">Nel programma la soluzione compare dopo che hai registrato e ricostruito la scrittura.</w:t>
       </w:r>
     </w:p>
     <w:p>
@@ -44965,7 +44965,7 @@
           <w:sz w:val="18"/>
           <w:szCs w:val="18"/>
         </w:rPr>
-        <w:t xml:space="preserve">Nel programma questo riquadro compare dopo che hai registrato e ricostruito la scrittura.</w:t>
+        <w:t xml:space="preserve">Nel programma la soluzione compare dopo che hai registrato e ricostruito la scrittura.</w:t>
       </w:r>
     </w:p>
     <w:p>
@@ -45254,6 +45254,29 @@
     </w:p>
     <w:p>
       <w:pPr>
+        <w:spacing w:after="80" w:before="60"/>
+      </w:pPr>
+      <w:r>
+        <w:rPr>
+          <w:rFonts w:ascii="Calibri" w:cs="Calibri" w:eastAsia="Calibri" w:hAnsi="Calibri"/>
+          <w:b/>
+          <w:bCs/>
+          <w:sz w:val="21"/>
+          <w:szCs w:val="21"/>
+        </w:rPr>
+        <w:t xml:space="preserve">Dopo il tentativo: </w:t>
+      </w:r>
+      <w:r>
+        <w:rPr>
+          <w:rFonts w:ascii="Calibri" w:cs="Calibri" w:eastAsia="Calibri" w:hAnsi="Calibri"/>
+          <w:sz w:val="21"/>
+          <w:szCs w:val="21"/>
+        </w:rPr>
+        <w:t xml:space="preserve">Nel giornale il programma scrive una coppia di righe per cespite (D 50 125 / A 02 125, poi 66,67 e 50); nel laboratorio di ragioneria puoi ricostruirla così oppure con un’unica riga D 50 241,67 / A 02 241,67. Se trovi 20% invece di 10% hai scritto un’aliquota diversa all’acquisto.</w:t>
+      </w:r>
+    </w:p>
+    <w:p>
+      <w:pPr>
         <w:spacing w:after="80" w:before="0"/>
       </w:pPr>
       <w:r>
@@ -45265,7 +45288,7 @@
           <w:sz w:val="18"/>
           <w:szCs w:val="18"/>
         </w:rPr>
-        <w:t xml:space="preserve">Nel programma questo riquadro compare dopo che hai registrato e ricostruito la scrittura.</w:t>
+        <w:t xml:space="preserve">Nel programma la soluzione compare dopo che hai registrato e ricostruito la scrittura.</w:t>
       </w:r>
     </w:p>
     <w:p>
@@ -45288,7 +45311,7 @@
           <w:sz w:val="21"/>
           <w:szCs w:val="21"/>
         </w:rPr>
-        <w:t xml:space="preserve">Il fisco ammette nel primo anno metà del coefficiente: 750, 400, 300. La quota di bilancio è più bassa: nessuna variazione fiscale. Nel giornale il programma scrive una coppia di righe per cespite (D 50 125 / A 02 125, poi 66,67 e 50); nel laboratorio di ragioneria puoi ricostruirla così oppure con un’unica riga D 50 241,67 / A 02 241,67. Se trovi 20% invece di 10% hai scritto un’aliquota diversa all’acquisto.</w:t>
+        <w:t xml:space="preserve">Il fisco ammette nel primo anno metà del coefficiente: 750, 400, 300. La quota di bilancio è più bassa: nessuna variazione fiscale.</w:t>
       </w:r>
     </w:p>
     <w:p>
@@ -47485,7 +47508,7 @@
           <w:sz w:val="18"/>
           <w:szCs w:val="18"/>
         </w:rPr>
-        <w:t xml:space="preserve">Nel programma questo riquadro compare dopo che hai registrato e ricostruito la scrittura.</w:t>
+        <w:t xml:space="preserve">Nel programma la soluzione compare dopo che hai registrato e ricostruito la scrittura.</w:t>
       </w:r>
     </w:p>
     <w:p>
@@ -51051,7 +51074,7 @@
           <w:sz w:val="18"/>
           <w:szCs w:val="18"/>
         </w:rPr>
-        <w:t xml:space="preserve">Nel programma questo riquadro compare dopo che hai registrato e ricostruito la scrittura.</w:t>
+        <w:t xml:space="preserve">Nel programma la soluzione compare dopo che hai registrato e ricostruito la scrittura.</w:t>
       </w:r>
     </w:p>
     <w:p>
@@ -51534,7 +51557,7 @@
           <w:sz w:val="18"/>
           <w:szCs w:val="18"/>
         </w:rPr>
-        <w:t xml:space="preserve">Nel programma questo riquadro compare dopo che hai registrato e ricostruito la scrittura.</w:t>
+        <w:t xml:space="preserve">Nel programma la soluzione compare dopo che hai registrato e ricostruito la scrittura.</w:t>
       </w:r>
     </w:p>
     <w:p>
@@ -52399,7 +52422,7 @@
           <w:sz w:val="18"/>
           <w:szCs w:val="18"/>
         </w:rPr>
-        <w:t xml:space="preserve">Nel programma questo riquadro compare dopo che hai registrato e ricostruito la scrittura.</w:t>
+        <w:t xml:space="preserve">Nel programma la soluzione compare dopo che hai registrato e ricostruito la scrittura.</w:t>
       </w:r>
     </w:p>
     <w:p>
@@ -53080,7 +53103,7 @@
           <w:sz w:val="18"/>
           <w:szCs w:val="18"/>
         </w:rPr>
-        <w:t xml:space="preserve">Nel programma questo riquadro compare dopo che hai registrato e ricostruito la scrittura.</w:t>
+        <w:t xml:space="preserve">Nel programma la soluzione compare dopo che hai registrato e ricostruito la scrittura.</w:t>
       </w:r>
     </w:p>
     <w:p>
@@ -53563,7 +53586,7 @@
           <w:sz w:val="18"/>
           <w:szCs w:val="18"/>
         </w:rPr>
-        <w:t xml:space="preserve">Nel programma questo riquadro compare dopo che hai registrato e ricostruito la scrittura.</w:t>
+        <w:t xml:space="preserve">Nel programma la soluzione compare dopo che hai registrato e ricostruito la scrittura.</w:t>
       </w:r>
     </w:p>
     <w:p>
@@ -53985,7 +54008,7 @@
           <w:sz w:val="18"/>
           <w:szCs w:val="18"/>
         </w:rPr>
-        <w:t xml:space="preserve">Nel programma questo riquadro compare dopo che hai registrato e ricostruito la scrittura.</w:t>
+        <w:t xml:space="preserve">Nel programma la soluzione compare dopo che hai registrato e ricostruito la scrittura.</w:t>
       </w:r>
     </w:p>
     <w:p>
@@ -54346,7 +54369,7 @@
           <w:sz w:val="18"/>
           <w:szCs w:val="18"/>
         </w:rPr>
-        <w:t xml:space="preserve">Nel programma questo riquadro compare dopo che hai registrato e ricostruito la scrittura.</w:t>
+        <w:t xml:space="preserve">Nel programma la soluzione compare dopo che hai registrato e ricostruito la scrittura.</w:t>
       </w:r>
     </w:p>
     <w:p>
@@ -54730,7 +54753,7 @@
           <w:sz w:val="18"/>
           <w:szCs w:val="18"/>
         </w:rPr>
-        <w:t xml:space="preserve">Nel programma questo riquadro compare dopo che hai registrato e ricostruito la scrittura.</w:t>
+        <w:t xml:space="preserve">Nel programma la soluzione compare dopo che hai registrato e ricostruito la scrittura.</w:t>
       </w:r>
     </w:p>
     <w:p>

</xml_diff>

<commit_message>
Chiusura e riapertura: l'allievo ricostruisce anche queste scritture prima di vedere la soluzione
- Epilogo nel conto economico, chiusura nello stato patrimoniale e
  riapertura dei conti generano la domanda di ragioneria come gli altri
  documenti (prima erano escluse come scritture meccaniche).
- «Riapri i conti al 1° gennaio 2027/2028» marcati contabili: la scrittura
  attesa compare solo dopo il tentativo.
- tests/soluzione-nascosta.js controlla anche che ogni passo con una
  scrittura sia contabile e che chiusura e riapertura non siano escluse.

Co-Authored-By: Claude Opus 5.5 <noreply@anthropic.com>
Claude-Session: https://claude.ai/code/session_01GvdGiBc9qkzwbxMtpiwpr2
</commit_message>
<xml_diff>
--- a/app/static/docs/Esercitazione_Dicembre_2026.docx
+++ b/app/static/docs/Esercitazione_Dicembre_2026.docx
@@ -52795,7 +52795,7 @@
           <w:sz w:val="21"/>
           <w:szCs w:val="21"/>
         </w:rPr>
-        <w:t xml:space="preserve">Controllo atteso: </w:t>
+        <w:t xml:space="preserve">Scrittura / controllo atteso: </w:t>
       </w:r>
       <w:r>
         <w:rPr>
@@ -52804,6 +52804,22 @@
           <w:szCs w:val="21"/>
         </w:rPr>
         <w:t xml:space="preserve">D attività / A 92 e D 92 / A passività per 99.309,38: macchine 29.000 (fondo 241,67), risconto 1.098,08, semilavorati 277,40, ferro 703, banca 51.886,42, credito Beta 12.912,48, IVA a credito 3.432; capitale 80.000, utile 1.814,98, anticipo bancario 10.329,98, rateo 1.033,33, debiti verso INPS, Erario, INAIL, agenti, TFR e imposte.</w:t>
+      </w:r>
+    </w:p>
+    <w:p>
+      <w:pPr>
+        <w:spacing w:after="80" w:before="0"/>
+      </w:pPr>
+      <w:r>
+        <w:rPr>
+          <w:rFonts w:ascii="Calibri" w:cs="Calibri" w:eastAsia="Calibri" w:hAnsi="Calibri"/>
+          <w:i/>
+          <w:iCs/>
+          <w:color w:val="555555"/>
+          <w:sz w:val="18"/>
+          <w:szCs w:val="18"/>
+        </w:rPr>
+        <w:t xml:space="preserve">Nel programma la soluzione compare dopo che hai registrato e ricostruito la scrittura.</w:t>
       </w:r>
     </w:p>
     <w:p>

</xml_diff>

<commit_message>
Correzioni dalla nota dell'allievo: pagamento alla fattura giusta e testo della chiusura
- F-53: se si indica la fattura, deve appartenere al fornitore scelto (la polizza
  POL-2026-118 non si può più pagare al fornitore dei macchinari proposto dal modulo)
- Guida: avviso di cambiare il fornitore nel pagamento della polizza
- Chiusura 2026/2027: la nota ora dice che il pannello chiede epilogo, utile e
  chiusura dello stato patrimoniale, con righe per conto o riepilogative
- Word, PDF ed esercitazione FORMAS rigenerati; test di regressione

Co-Authored-By: Claude Opus 5.5 <noreply@anthropic.com>
Claude-Session: https://claude.ai/code/session_01GvdGiBc9qkzwbxMtpiwpr2
</commit_message>
<xml_diff>
--- a/app/static/docs/Esercitazione_Dicembre_2026.docx
+++ b/app/static/docs/Esercitazione_Dicembre_2026.docx
@@ -15881,7 +15881,7 @@
                 <w:sz w:val="20"/>
                 <w:szCs w:val="20"/>
               </w:rPr>
-              <w:t xml:space="preserve">F400</w:t>
+              <w:t xml:space="preserve">F400 Assicurazioni Omega: cambialo, il modulo propone il primo fornitore con debiti aperti</w:t>
             </w:r>
           </w:p>
         </w:tc>
@@ -52445,7 +52445,7 @@
           <w:sz w:val="21"/>
           <w:szCs w:val="21"/>
         </w:rPr>
-        <w:t xml:space="preserve">Il pannello chiede di ricostruire solo il documento dell’utile: epilogo e chiusura dei conti patrimoniali sono riporti meccanici. Leggili nel libro giornale.</w:t>
+        <w:t xml:space="preserve">Il pannello chiede di ricostruire tutti e tre i documenti della chiusura: l’epilogo dei costi e dei ricavi, la rilevazione dell’utile e la chiusura delle attività e passività nello stato patrimoniale finale. Per epilogo e chiusura puoi scrivere una riga per conto oppure una riga riepilogativa per lato (totale costi, totale ricavi; totale attività, totale passività): conta che la scrittura quadri con i saldi. Poi confronta con il libro giornale.</w:t>
       </w:r>
     </w:p>
     <w:p>

</xml_diff>

<commit_message>
Paghe: addizionali IRPEF come nella realtà (Toscana e Firenze)
- Addizionale regionale Toscana a scaglioni (1,42 / 1,43 / 3,32 / 3,33%) e comunale
  Firenze 0,20% con esenzione fino a 25.000 €, calcolate al conguaglio di dicembre
  sull'imponibile IRPEF dell'anno (solo se l'IRPEF è dovuta)
- Trattenute l'anno dopo: saldo in 11 rate gen-nov (3802, 3848), acconto comunale
  30% in 9 rate mar-nov (3847); a dicembre nessuna rata; neoassunti nessuna rata
- Cedolino con riquadro delle addizionali da trattenere; F24 con i codici tributo
- Esercizio di dicembre: netti 5.865,08, ritenute 972,16, F24 3.928,87, banca al
  31/12 51.790,42 (finale invariata); guida, indicatori (i lavori già salvati restano
  valutati con i numeri di prima), Word, PDF e FORMAS aggiornati

Co-Authored-By: Claude Opus 5.5 <noreply@anthropic.com>
Claude-Session: https://claude.ai/code/session_01GvdGiBc9qkzwbxMtpiwpr2
</commit_message>
<xml_diff>
--- a/app/static/docs/Esercitazione_Dicembre_2026.docx
+++ b/app/static/docs/Esercitazione_Dicembre_2026.docx
@@ -42913,7 +42913,7 @@
           <w:sz w:val="21"/>
           <w:szCs w:val="21"/>
         </w:rPr>
-        <w:t xml:space="preserve">3 cedolini (assunti il 01/12: un solo mese). Con la tredicesima di 1/12 e il conguaglio IRPEF: netti 5.769,08; costo per l’azienda 10.426,96. Nessuna scrittura.</w:t>
+        <w:t xml:space="preserve">3 cedolini (assunti il 01/12: un solo mese). Con la tredicesima di 1/12 e il conguaglio IRPEF: netti 5.865,08; costo per l’azienda 10.426,96. Nessuna addizionale trattenuta a dicembre. Nessuna scrittura.</w:t>
       </w:r>
     </w:p>
     <w:p>
@@ -42936,7 +42936,7 @@
           <w:sz w:val="21"/>
           <w:szCs w:val="21"/>
         </w:rPr>
-        <w:t xml:space="preserve">Leggi un cedolino: la 13ª matura per i mesi lavorati, le detrazioni per lavoro dipendente si rapportano al periodo di lavoro.</w:t>
+        <w:t xml:space="preserve">Leggi un cedolino: la 13ª matura per i mesi lavorati, le detrazioni per lavoro dipendente si rapportano al periodo di lavoro. Leggi anche il riquadro delle addizionali: la regionale della Toscana (1,42% fino a 15.000 €) e la comunale di Firenze (0,20%, esente fino a 25.000 €) del 2026 si calcolano al conguaglio sull’imponibile dell’anno, ma si trattengono nel 2027 in 11 rate da gennaio a novembre. Assunti a dicembre, in busta non c’è nessuna rata: regionale 27,25 + 29,20 + 33,74 = 90,19 € da trattenere nel 2027, comunale zero (sotto i 25.000 €).</w:t>
       </w:r>
     </w:p>
     <w:p>
@@ -43281,7 +43281,7 @@
           <w:sz w:val="21"/>
           <w:szCs w:val="21"/>
         </w:rPr>
-        <w:t xml:space="preserve">D 80 Salari 7.529,17 + D 81 Oneri sociali 2.340,07 + D 82 TFR 557,72 / A 27 Netti 5.769,08 + A 28 INPS 2.956,71 + A 24 INAIL 112,94 + A 29 Ritenute 1.068,16 + A 31 Fondo TFR 520,07.</w:t>
+        <w:t xml:space="preserve">D 80 Salari 7.529,17 + D 81 Oneri sociali 2.340,07 + D 82 TFR 557,72 / A 27 Netti 5.865,08 + A 28 INPS 2.956,71 + A 24 INAIL 112,94 + A 29 Ritenute 972,16 + A 31 Fondo TFR 520,07.</w:t>
       </w:r>
     </w:p>
     <w:p>
@@ -43665,7 +43665,7 @@
           <w:sz w:val="21"/>
           <w:szCs w:val="21"/>
         </w:rPr>
-        <w:t xml:space="preserve">D 27 / A 10 5.769,08. Ritenute e contributi si versano con l’F24 a gennaio: a fine anno sono debiti.</w:t>
+        <w:t xml:space="preserve">D 27 / A 10 5.865,08. Ritenute e contributi si versano con l’F24 a gennaio: a fine anno sono debiti. Le addizionali 2026 no: non sono ancora state trattenute, quindi al 31/12 non sono un debito dell’azienda.</w:t>
       </w:r>
     </w:p>
     <w:p>
@@ -52803,7 +52803,7 @@
           <w:sz w:val="21"/>
           <w:szCs w:val="21"/>
         </w:rPr>
-        <w:t xml:space="preserve">D attività / A 92 e D 92 / A passività per 99.309,38: macchine 29.000 (fondo 241,67), risconto 1.098,08, semilavorati 277,40, ferro 703, banca 51.886,42, credito Beta 12.912,48, IVA a credito 3.432; capitale 80.000, utile 1.814,98, anticipo bancario 10.329,98, rateo 1.033,33, debiti verso INPS, Erario, INAIL, agenti, TFR e imposte.</w:t>
+        <w:t xml:space="preserve">D attività / A 92 e D 92 / A passività per 99.213,38: macchine 29.000 (fondo 241,67), risconto 1.098,08, semilavorati 277,40, ferro 703, banca 51.790,42, credito Beta 12.912,48, IVA a credito 3.432; capitale 80.000, utile 1.814,98, anticipo bancario 10.329,98, rateo 1.033,33, debiti verso INPS, Erario, INAIL, agenti, TFR e imposte.</w:t>
       </w:r>
     </w:p>
     <w:p>
@@ -54369,7 +54369,7 @@
           <w:sz w:val="21"/>
           <w:szCs w:val="21"/>
         </w:rPr>
-        <w:t xml:space="preserve">D 29 Erario 1.068,16 + D 28 INPS 2.956,71 / A 10 4.024,87. Banca 50.419,05.</w:t>
+        <w:t xml:space="preserve">D 29 Erario 972,16 + D 28 INPS 2.956,71 / A 10 3.928,87. Banca 50.419,05.</w:t>
       </w:r>
     </w:p>
     <w:p>
@@ -54408,7 +54408,7 @@
           <w:sz w:val="21"/>
           <w:szCs w:val="21"/>
         </w:rPr>
-        <w:t xml:space="preserve">Il 16 gennaio 2027 è sabato: la scadenza slitta al lunedì 18.</w:t>
+        <w:t xml:space="preserve">Il 16 gennaio 2027 è sabato: la scadenza slitta al lunedì 18. Nell’F24 c’è solo il codice 1001 (IRPEF): le addizionali regionali (3802) e comunali (3848, acconto 3847) compariranno negli F24 del 2027, dopo ogni rata trattenuta in busta.</w:t>
       </w:r>
     </w:p>
     <w:p>
@@ -55003,7 +55003,7 @@
                 <w:sz w:val="20"/>
                 <w:szCs w:val="20"/>
               </w:rPr>
-              <w:t xml:space="preserve">31/12/2026: 51.886,42 · dopo il 18/01/2027: 50.419,05</w:t>
+              <w:t xml:space="preserve">31/12/2026: 51.790,42 · dopo il 18/01/2027: 50.419,05</w:t>
             </w:r>
           </w:p>
         </w:tc>

</xml_diff>

<commit_message>
Passo 57: piano/consuntivo per periodo, attività assorbite e WIP senza duplicazioni
La pagina CO → Piano/consuntivo confrontava il budget annuo con 12 giorni di
consuntivo (colonna a zero, scostamenti di -42.000). Ora si legge in 4 riquadri:
attività (ore × tariffa = conto 72, con controllo), costi effettivi del periodo
letti da FI con avviso se le paghe del mese mancano, residuo e scostamenti sul
budget del periodo (annuo × mesi/12), ordini e WIP (materiali + attività = versato).
Guida, Markdown e PDF dell'esercitazione aggiornati.

Co-Authored-By: Claude Opus 5.5 <noreply@anthropic.com>
Claude-Session: https://claude.ai/code/session_01GvdGiBc9qkzwbxMtpiwpr2
</commit_message>
<xml_diff>
--- a/app/static/docs/Esercitazione_Dicembre_2026.docx
+++ b/app/static/docs/Esercitazione_Dicembre_2026.docx
@@ -30549,7 +30549,7 @@
           <w:sz w:val="21"/>
           <w:szCs w:val="21"/>
         </w:rPr>
-        <w:t xml:space="preserve">CO → Controllo di gestione → Piano/consuntivo e scostamenti; poi Consuntivo dei centri (KSB1)</w:t>
+        <w:t xml:space="preserve">CO → Controllo di gestione → Piano/consuntivo e scostamenti (la pagina si legge in 4 riquadri, dall’alto in basso)</w:t>
       </w:r>
     </w:p>
     <w:p>
@@ -30726,339 +30726,278 @@
                 <w:sz w:val="20"/>
                 <w:szCs w:val="20"/>
               </w:rPr>
-              <w:t xml:space="preserve">Taglio</w:t>
-            </w:r>
-          </w:p>
-        </w:tc>
-        <w:tc>
-          <w:tcPr>
-            <w:tcW w:type="dxa" w:w="6638"/>
-            <w:tcBorders>
-              <w:top w:val="single" w:color="B8C4D6" w:sz="4"/>
-              <w:left w:val="single" w:color="B8C4D6" w:sz="4"/>
-              <w:bottom w:val="single" w:color="B8C4D6" w:sz="4"/>
-              <w:right w:val="single" w:color="B8C4D6" w:sz="4"/>
-            </w:tcBorders>
-            <w:tcMar>
-              <w:top w:type="dxa" w:w="50"/>
-              <w:left w:type="dxa" w:w="90"/>
-              <w:bottom w:type="dxa" w:w="50"/>
-              <w:right w:type="dxa" w:w="90"/>
-            </w:tcMar>
-          </w:tcPr>
-          <w:p>
-            <w:r>
-              <w:rPr>
-                <w:rFonts w:ascii="Calibri" w:cs="Calibri" w:eastAsia="Calibri" w:hAnsi="Calibri"/>
-                <w:sz w:val="20"/>
-                <w:szCs w:val="20"/>
-              </w:rPr>
-              <w:t xml:space="preserve">75 h transenne + 5 h kit = 80 h × 28 = 2.240</w:t>
-            </w:r>
-          </w:p>
-        </w:tc>
-      </w:tr>
-      <w:tr>
-        <w:trPr>
-          <w:cantSplit/>
-        </w:trPr>
-        <w:tc>
-          <w:tcPr>
-            <w:tcW w:type="dxa" w:w="3000"/>
-            <w:tcBorders>
-              <w:top w:val="single" w:color="B8C4D6" w:sz="4"/>
-              <w:left w:val="single" w:color="B8C4D6" w:sz="4"/>
-              <w:bottom w:val="single" w:color="B8C4D6" w:sz="4"/>
-              <w:right w:val="single" w:color="B8C4D6" w:sz="4"/>
-            </w:tcBorders>
-            <w:tcMar>
-              <w:top w:type="dxa" w:w="50"/>
-              <w:left w:type="dxa" w:w="90"/>
-              <w:bottom w:type="dxa" w:w="50"/>
-              <w:right w:type="dxa" w:w="90"/>
-            </w:tcMar>
-          </w:tcPr>
-          <w:p>
-            <w:r>
-              <w:rPr>
-                <w:rFonts w:ascii="Calibri" w:cs="Calibri" w:eastAsia="Calibri" w:hAnsi="Calibri"/>
-                <w:b/>
-                <w:bCs/>
-                <w:sz w:val="20"/>
-                <w:szCs w:val="20"/>
-              </w:rPr>
-              <w:t xml:space="preserve">Piegatura</w:t>
-            </w:r>
-          </w:p>
-        </w:tc>
-        <w:tc>
-          <w:tcPr>
-            <w:tcW w:type="dxa" w:w="6638"/>
-            <w:tcBorders>
-              <w:top w:val="single" w:color="B8C4D6" w:sz="4"/>
-              <w:left w:val="single" w:color="B8C4D6" w:sz="4"/>
-              <w:bottom w:val="single" w:color="B8C4D6" w:sz="4"/>
-              <w:right w:val="single" w:color="B8C4D6" w:sz="4"/>
-            </w:tcBorders>
-            <w:tcMar>
-              <w:top w:type="dxa" w:w="50"/>
-              <w:left w:type="dxa" w:w="90"/>
-              <w:bottom w:type="dxa" w:w="50"/>
-              <w:right w:type="dxa" w:w="90"/>
-            </w:tcMar>
-          </w:tcPr>
-          <w:p>
-            <w:r>
-              <w:rPr>
-                <w:rFonts w:ascii="Calibri" w:cs="Calibri" w:eastAsia="Calibri" w:hAnsi="Calibri"/>
-                <w:sz w:val="20"/>
-                <w:szCs w:val="20"/>
-              </w:rPr>
-              <w:t xml:space="preserve">60 h × 28 = 1.680</w:t>
-            </w:r>
-          </w:p>
-        </w:tc>
-      </w:tr>
-      <w:tr>
-        <w:trPr>
-          <w:cantSplit/>
-        </w:trPr>
-        <w:tc>
-          <w:tcPr>
-            <w:tcW w:type="dxa" w:w="3000"/>
-            <w:tcBorders>
-              <w:top w:val="single" w:color="B8C4D6" w:sz="4"/>
-              <w:left w:val="single" w:color="B8C4D6" w:sz="4"/>
-              <w:bottom w:val="single" w:color="B8C4D6" w:sz="4"/>
-              <w:right w:val="single" w:color="B8C4D6" w:sz="4"/>
-            </w:tcBorders>
-            <w:tcMar>
-              <w:top w:type="dxa" w:w="50"/>
-              <w:left w:type="dxa" w:w="90"/>
-              <w:bottom w:type="dxa" w:w="50"/>
-              <w:right w:type="dxa" w:w="90"/>
-            </w:tcMar>
-          </w:tcPr>
-          <w:p>
-            <w:r>
-              <w:rPr>
-                <w:rFonts w:ascii="Calibri" w:cs="Calibri" w:eastAsia="Calibri" w:hAnsi="Calibri"/>
-                <w:b/>
-                <w:bCs/>
-                <w:sz w:val="20"/>
-                <w:szCs w:val="20"/>
-              </w:rPr>
-              <w:t xml:space="preserve">Saldatura</w:t>
-            </w:r>
-          </w:p>
-        </w:tc>
-        <w:tc>
-          <w:tcPr>
-            <w:tcW w:type="dxa" w:w="6638"/>
-            <w:tcBorders>
-              <w:top w:val="single" w:color="B8C4D6" w:sz="4"/>
-              <w:left w:val="single" w:color="B8C4D6" w:sz="4"/>
-              <w:bottom w:val="single" w:color="B8C4D6" w:sz="4"/>
-              <w:right w:val="single" w:color="B8C4D6" w:sz="4"/>
-            </w:tcBorders>
-            <w:tcMar>
-              <w:top w:type="dxa" w:w="50"/>
-              <w:left w:type="dxa" w:w="90"/>
-              <w:bottom w:type="dxa" w:w="50"/>
-              <w:right w:type="dxa" w:w="90"/>
-            </w:tcMar>
-          </w:tcPr>
-          <w:p>
-            <w:r>
-              <w:rPr>
-                <w:rFonts w:ascii="Calibri" w:cs="Calibri" w:eastAsia="Calibri" w:hAnsi="Calibri"/>
-                <w:sz w:val="20"/>
-                <w:szCs w:val="20"/>
-              </w:rPr>
-              <w:t xml:space="preserve">120 h × 28 = 3.360</w:t>
-            </w:r>
-          </w:p>
-        </w:tc>
-      </w:tr>
-      <w:tr>
-        <w:trPr>
-          <w:cantSplit/>
-        </w:trPr>
-        <w:tc>
-          <w:tcPr>
-            <w:tcW w:type="dxa" w:w="3000"/>
-            <w:tcBorders>
-              <w:top w:val="single" w:color="B8C4D6" w:sz="4"/>
-              <w:left w:val="single" w:color="B8C4D6" w:sz="4"/>
-              <w:bottom w:val="single" w:color="B8C4D6" w:sz="4"/>
-              <w:right w:val="single" w:color="B8C4D6" w:sz="4"/>
-            </w:tcBorders>
-            <w:tcMar>
-              <w:top w:type="dxa" w:w="50"/>
-              <w:left w:type="dxa" w:w="90"/>
-              <w:bottom w:type="dxa" w:w="50"/>
-              <w:right w:type="dxa" w:w="90"/>
-            </w:tcMar>
-          </w:tcPr>
-          <w:p>
-            <w:r>
-              <w:rPr>
-                <w:rFonts w:ascii="Calibri" w:cs="Calibri" w:eastAsia="Calibri" w:hAnsi="Calibri"/>
-                <w:b/>
-                <w:bCs/>
-                <w:sz w:val="20"/>
-                <w:szCs w:val="20"/>
-              </w:rPr>
-              <w:t xml:space="preserve">Totale attività</w:t>
-            </w:r>
-          </w:p>
-        </w:tc>
-        <w:tc>
-          <w:tcPr>
-            <w:tcW w:type="dxa" w:w="6638"/>
-            <w:tcBorders>
-              <w:top w:val="single" w:color="B8C4D6" w:sz="4"/>
-              <w:left w:val="single" w:color="B8C4D6" w:sz="4"/>
-              <w:bottom w:val="single" w:color="B8C4D6" w:sz="4"/>
-              <w:right w:val="single" w:color="B8C4D6" w:sz="4"/>
-            </w:tcBorders>
-            <w:tcMar>
-              <w:top w:type="dxa" w:w="50"/>
-              <w:left w:type="dxa" w:w="90"/>
-              <w:bottom w:type="dxa" w:w="50"/>
-              <w:right w:type="dxa" w:w="90"/>
-            </w:tcMar>
-          </w:tcPr>
-          <w:p>
-            <w:r>
-              <w:rPr>
-                <w:rFonts w:ascii="Calibri" w:cs="Calibri" w:eastAsia="Calibri" w:hAnsi="Calibri"/>
-                <w:sz w:val="20"/>
-                <w:szCs w:val="20"/>
-              </w:rPr>
-              <w:t xml:space="preserve">260 h e 7.280, coincidenti con le conferme D72/A75 dei due ordini (KSB1, classe 944000)</w:t>
-            </w:r>
-          </w:p>
-        </w:tc>
-      </w:tr>
-      <w:tr>
-        <w:trPr>
-          <w:cantSplit/>
-        </w:trPr>
-        <w:tc>
-          <w:tcPr>
-            <w:tcW w:type="dxa" w:w="3000"/>
-            <w:tcBorders>
-              <w:top w:val="single" w:color="B8C4D6" w:sz="4"/>
-              <w:left w:val="single" w:color="B8C4D6" w:sz="4"/>
-              <w:bottom w:val="single" w:color="B8C4D6" w:sz="4"/>
-              <w:right w:val="single" w:color="B8C4D6" w:sz="4"/>
-            </w:tcBorders>
-            <w:tcMar>
-              <w:top w:type="dxa" w:w="50"/>
-              <w:left w:type="dxa" w:w="90"/>
-              <w:bottom w:type="dxa" w:w="50"/>
-              <w:right w:type="dxa" w:w="90"/>
-            </w:tcMar>
-          </w:tcPr>
-          <w:p>
-            <w:r>
-              <w:rPr>
-                <w:rFonts w:ascii="Calibri" w:cs="Calibri" w:eastAsia="Calibri" w:hAnsi="Calibri"/>
-                <w:b/>
-                <w:bCs/>
-                <w:sz w:val="20"/>
-                <w:szCs w:val="20"/>
-              </w:rPr>
-              <w:t xml:space="preserve">Piano annuale / consuntivo ordini</w:t>
-            </w:r>
-          </w:p>
-        </w:tc>
-        <w:tc>
-          <w:tcPr>
-            <w:tcW w:type="dxa" w:w="6638"/>
-            <w:tcBorders>
-              <w:top w:val="single" w:color="B8C4D6" w:sz="4"/>
-              <w:left w:val="single" w:color="B8C4D6" w:sz="4"/>
-              <w:bottom w:val="single" w:color="B8C4D6" w:sz="4"/>
-              <w:right w:val="single" w:color="B8C4D6" w:sz="4"/>
-            </w:tcBorders>
-            <w:tcMar>
-              <w:top w:type="dxa" w:w="50"/>
-              <w:left w:type="dxa" w:w="90"/>
-              <w:bottom w:type="dxa" w:w="50"/>
-              <w:right w:type="dxa" w:w="90"/>
-            </w:tcMar>
-          </w:tcPr>
-          <w:p>
-            <w:r>
-              <w:rPr>
-                <w:rFonts w:ascii="Calibri" w:cs="Calibri" w:eastAsia="Calibri" w:hAnsi="Calibri"/>
-                <w:sz w:val="20"/>
-                <w:szCs w:val="20"/>
-              </w:rPr>
-              <w:t xml:space="preserve">Ore annuali 300/240/480 contro ore effettivamente dichiarate 80/60/120; il budget non rappresenta produzione già avvenuta</w:t>
-            </w:r>
-          </w:p>
-        </w:tc>
-      </w:tr>
-      <w:tr>
-        <w:trPr>
-          <w:cantSplit/>
-        </w:trPr>
-        <w:tc>
-          <w:tcPr>
-            <w:tcW w:type="dxa" w:w="3000"/>
-            <w:tcBorders>
-              <w:top w:val="single" w:color="B8C4D6" w:sz="4"/>
-              <w:left w:val="single" w:color="B8C4D6" w:sz="4"/>
-              <w:bottom w:val="single" w:color="B8C4D6" w:sz="4"/>
-              <w:right w:val="single" w:color="B8C4D6" w:sz="4"/>
-            </w:tcBorders>
-            <w:tcMar>
-              <w:top w:type="dxa" w:w="50"/>
-              <w:left w:type="dxa" w:w="90"/>
-              <w:bottom w:type="dxa" w:w="50"/>
-              <w:right w:type="dxa" w:w="90"/>
-            </w:tcMar>
-          </w:tcPr>
-          <w:p>
-            <w:r>
-              <w:rPr>
-                <w:rFonts w:ascii="Calibri" w:cs="Calibri" w:eastAsia="Calibri" w:hAnsi="Calibri"/>
-                <w:b/>
-                <w:bCs/>
-                <w:sz w:val="20"/>
-                <w:szCs w:val="20"/>
-              </w:rPr>
-              <w:t xml:space="preserve">Costi primari</w:t>
-            </w:r>
-          </w:p>
-        </w:tc>
-        <w:tc>
-          <w:tcPr>
-            <w:tcW w:type="dxa" w:w="6638"/>
-            <w:tcBorders>
-              <w:top w:val="single" w:color="B8C4D6" w:sz="4"/>
-              <w:left w:val="single" w:color="B8C4D6" w:sz="4"/>
-              <w:bottom w:val="single" w:color="B8C4D6" w:sz="4"/>
-              <w:right w:val="single" w:color="B8C4D6" w:sz="4"/>
-            </w:tcBorders>
-            <w:tcMar>
-              <w:top w:type="dxa" w:w="50"/>
-              <w:left w:type="dxa" w:w="90"/>
-              <w:bottom w:type="dxa" w:w="50"/>
-              <w:right w:type="dxa" w:w="90"/>
-            </w:tcMar>
-          </w:tcPr>
-          <w:p>
-            <w:r>
-              <w:rPr>
-                <w:rFonts w:ascii="Calibri" w:cs="Calibri" w:eastAsia="Calibri" w:hAnsi="Calibri"/>
-                <w:sz w:val="20"/>
-                <w:szCs w:val="20"/>
-              </w:rPr>
-              <w:t xml:space="preserve">Arrivano da soli dalla contabilità: a metà dicembre ci sono solo i costi già registrati (per esempio nessuna paga). Zero non significa personale gratuito: la paga di dicembre non è ancora registrata</w:t>
+              <w:t xml:space="preserve">Periodo</w:t>
+            </w:r>
+          </w:p>
+        </w:tc>
+        <w:tc>
+          <w:tcPr>
+            <w:tcW w:type="dxa" w:w="6638"/>
+            <w:tcBorders>
+              <w:top w:val="single" w:color="B8C4D6" w:sz="4"/>
+              <w:left w:val="single" w:color="B8C4D6" w:sz="4"/>
+              <w:bottom w:val="single" w:color="B8C4D6" w:sz="4"/>
+              <w:right w:val="single" w:color="B8C4D6" w:sz="4"/>
+            </w:tcBorders>
+            <w:tcMar>
+              <w:top w:type="dxa" w:w="50"/>
+              <w:left w:type="dxa" w:w="90"/>
+              <w:bottom w:type="dxa" w:w="50"/>
+              <w:right w:type="dxa" w:w="90"/>
+            </w:tcMar>
+          </w:tcPr>
+          <w:p>
+            <w:r>
+              <w:rPr>
+                <w:rFonts w:ascii="Calibri" w:cs="Calibri" w:eastAsia="Calibri" w:hAnsi="Calibri"/>
+                <w:sz w:val="20"/>
+                <w:szCs w:val="20"/>
+              </w:rPr>
+              <w:t xml:space="preserve">dicembre 2026: 1 mese su 12, quindi il budget del periodo è il budget annuo ÷ 12 (reparti 42.000 → 3.500; ore 1.500 → 125)</w:t>
+            </w:r>
+          </w:p>
+        </w:tc>
+      </w:tr>
+      <w:tr>
+        <w:trPr>
+          <w:cantSplit/>
+        </w:trPr>
+        <w:tc>
+          <w:tcPr>
+            <w:tcW w:type="dxa" w:w="3000"/>
+            <w:tcBorders>
+              <w:top w:val="single" w:color="B8C4D6" w:sz="4"/>
+              <w:left w:val="single" w:color="B8C4D6" w:sz="4"/>
+              <w:bottom w:val="single" w:color="B8C4D6" w:sz="4"/>
+              <w:right w:val="single" w:color="B8C4D6" w:sz="4"/>
+            </w:tcBorders>
+            <w:tcMar>
+              <w:top w:type="dxa" w:w="50"/>
+              <w:left w:type="dxa" w:w="90"/>
+              <w:bottom w:type="dxa" w:w="50"/>
+              <w:right w:type="dxa" w:w="90"/>
+            </w:tcMar>
+          </w:tcPr>
+          <w:p>
+            <w:r>
+              <w:rPr>
+                <w:rFonts w:ascii="Calibri" w:cs="Calibri" w:eastAsia="Calibri" w:hAnsi="Calibri"/>
+                <w:b/>
+                <w:bCs/>
+                <w:sz w:val="20"/>
+                <w:szCs w:val="20"/>
+              </w:rPr>
+              <w:t xml:space="preserve">1 · Attività</w:t>
+            </w:r>
+          </w:p>
+        </w:tc>
+        <w:tc>
+          <w:tcPr>
+            <w:tcW w:type="dxa" w:w="6638"/>
+            <w:tcBorders>
+              <w:top w:val="single" w:color="B8C4D6" w:sz="4"/>
+              <w:left w:val="single" w:color="B8C4D6" w:sz="4"/>
+              <w:bottom w:val="single" w:color="B8C4D6" w:sz="4"/>
+              <w:right w:val="single" w:color="B8C4D6" w:sz="4"/>
+            </w:tcBorders>
+            <w:tcMar>
+              <w:top w:type="dxa" w:w="50"/>
+              <w:left w:type="dxa" w:w="90"/>
+              <w:bottom w:type="dxa" w:w="50"/>
+              <w:right w:type="dxa" w:w="90"/>
+            </w:tcMar>
+          </w:tcPr>
+          <w:p>
+            <w:r>
+              <w:rPr>
+                <w:rFonts w:ascii="Calibri" w:cs="Calibri" w:eastAsia="Calibri" w:hAnsi="Calibri"/>
+                <w:sz w:val="20"/>
+                <w:szCs w:val="20"/>
+              </w:rPr>
+              <w:t xml:space="preserve">Taglio 75 h transenne + 5 h kit = 80 h × 28 = 2.240 · Piegatura 60 h × 28 = 1.680 · Saldatura 120 h × 28 = 3.360 · totale 260 h = 7.280, uguale al conto 72 (D 72 / A 75): la pagina mostra ✓. Var. efficienza 0</w:t>
+            </w:r>
+          </w:p>
+        </w:tc>
+      </w:tr>
+      <w:tr>
+        <w:trPr>
+          <w:cantSplit/>
+        </w:trPr>
+        <w:tc>
+          <w:tcPr>
+            <w:tcW w:type="dxa" w:w="3000"/>
+            <w:tcBorders>
+              <w:top w:val="single" w:color="B8C4D6" w:sz="4"/>
+              <w:left w:val="single" w:color="B8C4D6" w:sz="4"/>
+              <w:bottom w:val="single" w:color="B8C4D6" w:sz="4"/>
+              <w:right w:val="single" w:color="B8C4D6" w:sz="4"/>
+            </w:tcBorders>
+            <w:tcMar>
+              <w:top w:type="dxa" w:w="50"/>
+              <w:left w:type="dxa" w:w="90"/>
+              <w:bottom w:type="dxa" w:w="50"/>
+              <w:right w:type="dxa" w:w="90"/>
+            </w:tcMar>
+          </w:tcPr>
+          <w:p>
+            <w:r>
+              <w:rPr>
+                <w:rFonts w:ascii="Calibri" w:cs="Calibri" w:eastAsia="Calibri" w:hAnsi="Calibri"/>
+                <w:b/>
+                <w:bCs/>
+                <w:sz w:val="20"/>
+                <w:szCs w:val="20"/>
+              </w:rPr>
+              <w:t xml:space="preserve">2 · Costi effettivi</w:t>
+            </w:r>
+          </w:p>
+        </w:tc>
+        <w:tc>
+          <w:tcPr>
+            <w:tcW w:type="dxa" w:w="6638"/>
+            <w:tcBorders>
+              <w:top w:val="single" w:color="B8C4D6" w:sz="4"/>
+              <w:left w:val="single" w:color="B8C4D6" w:sz="4"/>
+              <w:bottom w:val="single" w:color="B8C4D6" w:sz="4"/>
+              <w:right w:val="single" w:color="B8C4D6" w:sz="4"/>
+            </w:tcBorders>
+            <w:tcMar>
+              <w:top w:type="dxa" w:w="50"/>
+              <w:left w:type="dxa" w:w="90"/>
+              <w:bottom w:type="dxa" w:w="50"/>
+              <w:right w:type="dxa" w:w="90"/>
+            </w:tcMar>
+          </w:tcPr>
+          <w:p>
+            <w:r>
+              <w:rPr>
+                <w:rFonts w:ascii="Calibri" w:cs="Calibri" w:eastAsia="Calibri" w:hAnsi="Calibri"/>
+                <w:sz w:val="20"/>
+                <w:szCs w:val="20"/>
+              </w:rPr>
+              <w:t xml:space="preserve">Consuntivo letto da solo dalla contabilità: c’è solo 4300 Amministrazione 1.200 (polizza, via OKB9). Reparti, 4100 e 4200 a zero: le paghe di dicembre non sono ancora registrate (riquadro giallo). Le 7.280 di attività NON si sommano qui</w:t>
+            </w:r>
+          </w:p>
+        </w:tc>
+      </w:tr>
+      <w:tr>
+        <w:trPr>
+          <w:cantSplit/>
+        </w:trPr>
+        <w:tc>
+          <w:tcPr>
+            <w:tcW w:type="dxa" w:w="3000"/>
+            <w:tcBorders>
+              <w:top w:val="single" w:color="B8C4D6" w:sz="4"/>
+              <w:left w:val="single" w:color="B8C4D6" w:sz="4"/>
+              <w:bottom w:val="single" w:color="B8C4D6" w:sz="4"/>
+              <w:right w:val="single" w:color="B8C4D6" w:sz="4"/>
+            </w:tcBorders>
+            <w:tcMar>
+              <w:top w:type="dxa" w:w="50"/>
+              <w:left w:type="dxa" w:w="90"/>
+              <w:bottom w:type="dxa" w:w="50"/>
+              <w:right w:type="dxa" w:w="90"/>
+            </w:tcMar>
+          </w:tcPr>
+          <w:p>
+            <w:r>
+              <w:rPr>
+                <w:rFonts w:ascii="Calibri" w:cs="Calibri" w:eastAsia="Calibri" w:hAnsi="Calibri"/>
+                <w:b/>
+                <w:bCs/>
+                <w:sz w:val="20"/>
+                <w:szCs w:val="20"/>
+              </w:rPr>
+              <w:t xml:space="preserve">3 · Residuo dei reparti</w:t>
+            </w:r>
+          </w:p>
+        </w:tc>
+        <w:tc>
+          <w:tcPr>
+            <w:tcW w:type="dxa" w:w="6638"/>
+            <w:tcBorders>
+              <w:top w:val="single" w:color="B8C4D6" w:sz="4"/>
+              <w:left w:val="single" w:color="B8C4D6" w:sz="4"/>
+              <w:bottom w:val="single" w:color="B8C4D6" w:sz="4"/>
+              <w:right w:val="single" w:color="B8C4D6" w:sz="4"/>
+            </w:tcBorders>
+            <w:tcMar>
+              <w:top w:type="dxa" w:w="50"/>
+              <w:left w:type="dxa" w:w="90"/>
+              <w:bottom w:type="dxa" w:w="50"/>
+              <w:right w:type="dxa" w:w="90"/>
+            </w:tcMar>
+          </w:tcPr>
+          <w:p>
+            <w:r>
+              <w:rPr>
+                <w:rFonts w:ascii="Calibri" w:cs="Calibri" w:eastAsia="Calibri" w:hAnsi="Calibri"/>
+                <w:sz w:val="20"/>
+                <w:szCs w:val="20"/>
+              </w:rPr>
+              <w:t xml:space="preserve">Consuntivo 0 − attività 2.240 / 1.680 / 3.360 = residuo −2.240 / −1.680 / −3.360: gli ordini hanno già ricevuto il costo delle ore, i costi veri arriveranno con le paghe e le scritture di fine mese. Spesa −3.500 e assorbimento 1.260 / 1.820 / 140 si leggono a fine mese</w:t>
+            </w:r>
+          </w:p>
+        </w:tc>
+      </w:tr>
+      <w:tr>
+        <w:trPr>
+          <w:cantSplit/>
+        </w:trPr>
+        <w:tc>
+          <w:tcPr>
+            <w:tcW w:type="dxa" w:w="3000"/>
+            <w:tcBorders>
+              <w:top w:val="single" w:color="B8C4D6" w:sz="4"/>
+              <w:left w:val="single" w:color="B8C4D6" w:sz="4"/>
+              <w:bottom w:val="single" w:color="B8C4D6" w:sz="4"/>
+              <w:right w:val="single" w:color="B8C4D6" w:sz="4"/>
+            </w:tcBorders>
+            <w:tcMar>
+              <w:top w:type="dxa" w:w="50"/>
+              <w:left w:type="dxa" w:w="90"/>
+              <w:bottom w:type="dxa" w:w="50"/>
+              <w:right w:type="dxa" w:w="90"/>
+            </w:tcMar>
+          </w:tcPr>
+          <w:p>
+            <w:r>
+              <w:rPr>
+                <w:rFonts w:ascii="Calibri" w:cs="Calibri" w:eastAsia="Calibri" w:hAnsi="Calibri"/>
+                <w:b/>
+                <w:bCs/>
+                <w:sz w:val="20"/>
+                <w:szCs w:val="20"/>
+              </w:rPr>
+              <w:t xml:space="preserve">4 · Ordini e WIP</w:t>
+            </w:r>
+          </w:p>
+        </w:tc>
+        <w:tc>
+          <w:tcPr>
+            <w:tcW w:type="dxa" w:w="6638"/>
+            <w:tcBorders>
+              <w:top w:val="single" w:color="B8C4D6" w:sz="4"/>
+              <w:left w:val="single" w:color="B8C4D6" w:sz="4"/>
+              <w:bottom w:val="single" w:color="B8C4D6" w:sz="4"/>
+              <w:right w:val="single" w:color="B8C4D6" w:sz="4"/>
+            </w:tcBorders>
+            <w:tcMar>
+              <w:top w:type="dxa" w:w="50"/>
+              <w:left w:type="dxa" w:w="90"/>
+              <w:bottom w:type="dxa" w:w="50"/>
+              <w:right w:type="dxa" w:w="90"/>
+            </w:tcMar>
+          </w:tcPr>
+          <w:p>
+            <w:r>
+              <w:rPr>
+                <w:rFonts w:ascii="Calibri" w:cs="Calibri" w:eastAsia="Calibri" w:hAnsi="Calibri"/>
+                <w:sz w:val="20"/>
+                <w:szCs w:val="20"/>
+              </w:rPr>
+              <w:t xml:space="preserve">Transenne: materiali 2.280 + attività 7.140 = 9.420 · kit HALB: 152 + 140 = 292 · versato a magazzino 9.712, WIP 0: ogni euro contato una volta</w:t>
             </w:r>
           </w:p>
         </w:tc>
@@ -31084,7 +31023,7 @@
           <w:sz w:val="21"/>
           <w:szCs w:val="21"/>
         </w:rPr>
-        <w:t xml:space="preserve">Le attività valorizzate sono costi attribuiti agli ordini, non un secondo costo del personale. Le ore coincidono con lo standard dei pezzi confermati: varianza di efficienza zero in questo caso.</w:t>
+        <w:t xml:space="preserve">Le attività valorizzate (7.280) sono costo dei centri spostato sugli ordini, non un secondo costo del personale: compaiono nel riquadro 1 e nel 4, mai nel consuntivo del riquadro 2. A metà mese il residuo negativo è normale.</w:t>
       </w:r>
     </w:p>
     <w:p>
@@ -31107,7 +31046,7 @@
           <w:sz w:val="21"/>
           <w:szCs w:val="21"/>
         </w:rPr>
-        <w:t xml:space="preserve">Residuo centro = costi primari effettivi più costi comuni effettivi ribaltati meno attività assorbite: non equivale automaticamente a inefficienza. Gli output dei due ordini sono 9.420 + 292 = 9.712; WIP analitico residuo zero dopo i 101, senza capitalizzazione FI automatica.</w:t>
+        <w:t xml:space="preserve">Residuo = consuntivo − attività assorbite = scostamento di spesa + scostamento di assorbimento; non è automaticamente inefficienza. Nel menu «Periodo» puoi scegliere il mese: il budget del periodo cambia con i mesi trascorsi. Il dettaglio delle righe del consuntivo è in Consuntivo dei centri (KSB1).</w:t>
       </w:r>
     </w:p>
     <w:p>

</xml_diff>

<commit_message>
Passo 57: da dove vengono i numeri e scostamenti reparto per reparto
Co-Authored-By: Claude Opus 5.5 <noreply@anthropic.com>
Claude-Session: https://claude.ai/code/session_01GvdGiBc9qkzwbxMtpiwpr2
</commit_message>
<xml_diff>
--- a/app/static/docs/Esercitazione_Dicembre_2026.docx
+++ b/app/static/docs/Esercitazione_Dicembre_2026.docx
@@ -30998,6 +30998,128 @@
                 <w:szCs w:val="20"/>
               </w:rPr>
               <w:t xml:space="preserve">Transenne: materiali 2.280 + attività 7.140 = 9.420 · kit HALB: 152 + 140 = 292 · versato a magazzino 9.712, WIP 0: ogni euro contato una volta</w:t>
+            </w:r>
+          </w:p>
+        </w:tc>
+      </w:tr>
+      <w:tr>
+        <w:trPr>
+          <w:cantSplit/>
+        </w:trPr>
+        <w:tc>
+          <w:tcPr>
+            <w:tcW w:type="dxa" w:w="3000"/>
+            <w:tcBorders>
+              <w:top w:val="single" w:color="B8C4D6" w:sz="4"/>
+              <w:left w:val="single" w:color="B8C4D6" w:sz="4"/>
+              <w:bottom w:val="single" w:color="B8C4D6" w:sz="4"/>
+              <w:right w:val="single" w:color="B8C4D6" w:sz="4"/>
+            </w:tcBorders>
+            <w:tcMar>
+              <w:top w:type="dxa" w:w="50"/>
+              <w:left w:type="dxa" w:w="90"/>
+              <w:bottom w:type="dxa" w:w="50"/>
+              <w:right w:type="dxa" w:w="90"/>
+            </w:tcMar>
+          </w:tcPr>
+          <w:p>
+            <w:r>
+              <w:rPr>
+                <w:rFonts w:ascii="Calibri" w:cs="Calibri" w:eastAsia="Calibri" w:hAnsi="Calibri"/>
+                <w:b/>
+                <w:bCs/>
+                <w:sz w:val="20"/>
+                <w:szCs w:val="20"/>
+              </w:rPr>
+              <w:t xml:space="preserve">Da dove vengono i numeri</w:t>
+            </w:r>
+          </w:p>
+        </w:tc>
+        <w:tc>
+          <w:tcPr>
+            <w:tcW w:type="dxa" w:w="6638"/>
+            <w:tcBorders>
+              <w:top w:val="single" w:color="B8C4D6" w:sz="4"/>
+              <w:left w:val="single" w:color="B8C4D6" w:sz="4"/>
+              <w:bottom w:val="single" w:color="B8C4D6" w:sz="4"/>
+              <w:right w:val="single" w:color="B8C4D6" w:sz="4"/>
+            </w:tcBorders>
+            <w:tcMar>
+              <w:top w:type="dxa" w:w="50"/>
+              <w:left w:type="dxa" w:w="90"/>
+              <w:bottom w:type="dxa" w:w="50"/>
+              <w:right w:type="dxa" w:w="90"/>
+            </w:tcMar>
+          </w:tcPr>
+          <w:p>
+            <w:r>
+              <w:rPr>
+                <w:rFonts w:ascii="Calibri" w:cs="Calibri" w:eastAsia="Calibri" w:hAnsi="Calibri"/>
+                <w:sz w:val="20"/>
+                <w:szCs w:val="20"/>
+              </w:rPr>
+              <w:t xml:space="preserve">Tariffa 28 €/h = costo annuo del reparto (36.000 personale KP06 + 6.000 costi comuni ribaltati KSU1 = 42.000) ÷ 1.500 ore pianificate (KP26). Ore = pezzi × tempo del ciclo: Taglio 300 × 0,25 = 75 + 20 kit × 0,25 = 5; Piegatura 300 × 0,20 = 60; Saldatura 300 × 0,40 = 120. Ferro: 300 × 8 kg = 2.400 kg × 0,95 = 2.280; kit 20 × 8 kg = 160 kg × 0,95 = 152. Attività transenne 7.140 = (75 + 60 + 120) × 28; kit 140 = 5 × 28</w:t>
+            </w:r>
+          </w:p>
+        </w:tc>
+      </w:tr>
+      <w:tr>
+        <w:trPr>
+          <w:cantSplit/>
+        </w:trPr>
+        <w:tc>
+          <w:tcPr>
+            <w:tcW w:type="dxa" w:w="3000"/>
+            <w:tcBorders>
+              <w:top w:val="single" w:color="B8C4D6" w:sz="4"/>
+              <w:left w:val="single" w:color="B8C4D6" w:sz="4"/>
+              <w:bottom w:val="single" w:color="B8C4D6" w:sz="4"/>
+              <w:right w:val="single" w:color="B8C4D6" w:sz="4"/>
+            </w:tcBorders>
+            <w:tcMar>
+              <w:top w:type="dxa" w:w="50"/>
+              <w:left w:type="dxa" w:w="90"/>
+              <w:bottom w:type="dxa" w:w="50"/>
+              <w:right w:type="dxa" w:w="90"/>
+            </w:tcMar>
+          </w:tcPr>
+          <w:p>
+            <w:r>
+              <w:rPr>
+                <w:rFonts w:ascii="Calibri" w:cs="Calibri" w:eastAsia="Calibri" w:hAnsi="Calibri"/>
+                <w:b/>
+                <w:bCs/>
+                <w:sz w:val="20"/>
+                <w:szCs w:val="20"/>
+              </w:rPr>
+              <w:t xml:space="preserve">Scostamenti del riquadro 3, reparto per reparto</w:t>
+            </w:r>
+          </w:p>
+        </w:tc>
+        <w:tc>
+          <w:tcPr>
+            <w:tcW w:type="dxa" w:w="6638"/>
+            <w:tcBorders>
+              <w:top w:val="single" w:color="B8C4D6" w:sz="4"/>
+              <w:left w:val="single" w:color="B8C4D6" w:sz="4"/>
+              <w:bottom w:val="single" w:color="B8C4D6" w:sz="4"/>
+              <w:right w:val="single" w:color="B8C4D6" w:sz="4"/>
+            </w:tcBorders>
+            <w:tcMar>
+              <w:top w:type="dxa" w:w="50"/>
+              <w:left w:type="dxa" w:w="90"/>
+              <w:bottom w:type="dxa" w:w="50"/>
+              <w:right w:type="dxa" w:w="90"/>
+            </w:tcMar>
+          </w:tcPr>
+          <w:p>
+            <w:r>
+              <w:rPr>
+                <w:rFonts w:ascii="Calibri" w:cs="Calibri" w:eastAsia="Calibri" w:hAnsi="Calibri"/>
+                <w:sz w:val="20"/>
+                <w:szCs w:val="20"/>
+              </w:rPr>
+              <w:t xml:space="preserve">Taglio: spesa = consuntivo 0 − budget del periodo 3.500 = −3.500; assorbimento = 3.500 − 2.240 = 1.260; somma −2.240 = residuo. Piegatura: −3.500 + (3.500 − 1.680 = 1.820) = −1.680. Saldatura: −3.500 + (3.500 − 3.360 = 140) = −3.360. Efficienza 0: ore dichiarate = ore standard dei pezzi confermati</w:t>
             </w:r>
           </w:p>
         </w:tc>

</xml_diff>